<commit_message>
chore(pitch): regenerated PDF/DOCX exports for updated docs
Re-ran scripts/export-docs.mjs after this cycle's content updates:
- New VIDEO_SCRIPT structure (Web 2.5 thesis upfront, killer demo near end)
- 90/5/5 burn split in ECONOMY, WEB_25_MANIFESTO, PITCH_DECK, TWITTER,
  EMAIL, README, rules
- Rookie/Veteran/Master labels referenced in PITCH_DECK
- NFT gold-frame mention in PITCH_DECK slide 3 + slide 5

All 26 exports (13 PDF + 13 DOCX) regenerated.

Co-Authored-By: Claude Opus 4.7 (1M context) <noreply@anthropic.com>
</commit_message>
<xml_diff>
--- a/pitch/exports/README.docx
+++ b/pitch/exports/README.docx
@@ -1498,7 +1498,7 @@
         <w:t xml:space="preserve"> </w:t>
       </w:r>
       <w:r>
-        <w:t xml:space="preserve">(Novato / Avanzado / Experto difficulties)</w:t>
+        <w:t xml:space="preserve">(Rookie / Veteran / Master difficulties)</w:t>
       </w:r>
     </w:p>
     <w:p>
@@ -1561,7 +1561,20 @@
         <w:t xml:space="preserve"> </w:t>
       </w:r>
       <w:r>
-        <w:t xml:space="preserve">in tournaments (AXS/SLP entry, 10% burn, 90% prize pool)</w:t>
+        <w:t xml:space="preserve">in tournaments (AXS/SLP entry,</w:t>
+      </w:r>
+      <w:r>
+        <w:t xml:space="preserve"> </w:t>
+      </w:r>
+      <w:r>
+        <w:rPr>
+          <w:b/>
+          <w:bCs/>
+        </w:rPr>
+        <w:t xml:space="preserve">90 % players · 5 % burn · 5 % game treasury</w:t>
+      </w:r>
+      <w:r>
+        <w:t xml:space="preserve">)</w:t>
       </w:r>
     </w:p>
     <w:p>

</xml_diff>